<commit_message>
docs(root): reorganiza documentos e atualiza estrutura do projeto
</commit_message>
<xml_diff>
--- a/Documentos/template_estilos.docx
+++ b/Documentos/template_estilos.docx
@@ -13,7 +13,12 @@
           <w:bCs/>
           <w:smallCaps/>
           <w:color w:val="auto"/>
-          <w:lang w:val="pt-BR" w:eastAsia="pt-BR"/>
+          <w:lang w:eastAsia="pt-BR"/>
+          <w14:shadow w14:blurRad="50800" w14:dist="38100" w14:dir="2700000" w14:sx="100000" w14:sy="100000" w14:kx="0" w14:ky="0" w14:algn="tl">
+            <w14:srgbClr w14:val="000000">
+              <w14:alpha w14:val="60000"/>
+            </w14:srgbClr>
+          </w14:shadow>
         </w:rPr>
       </w:pPr>
       <w:r>
@@ -23,7 +28,12 @@
           <w:bCs/>
           <w:smallCaps/>
           <w:color w:val="auto"/>
-          <w:lang w:val="pt-BR" w:eastAsia="pt-BR"/>
+          <w:lang w:eastAsia="pt-BR"/>
+          <w14:shadow w14:blurRad="50800" w14:dist="38100" w14:dir="2700000" w14:sx="100000" w14:sy="100000" w14:kx="0" w14:ky="0" w14:algn="tl">
+            <w14:srgbClr w14:val="000000">
+              <w14:alpha w14:val="60000"/>
+            </w14:srgbClr>
+          </w14:shadow>
         </w:rPr>
         <w:t>Title</w:t>
       </w:r>
@@ -93,12 +103,30 @@
         <w:pStyle w:val="Ttulo1"/>
         <w:rPr>
           <w:rFonts w:ascii="Arial" w:hAnsi="Arial" w:cs="Arial"/>
+          <w:b/>
+          <w:bCs/>
+          <w:smallCaps/>
+          <w:color w:val="EE0000"/>
+          <w14:shadow w14:blurRad="50800" w14:dist="38100" w14:dir="2700000" w14:sx="100000" w14:sy="100000" w14:kx="0" w14:ky="0" w14:algn="tl">
+            <w14:srgbClr w14:val="000000">
+              <w14:alpha w14:val="60000"/>
+            </w14:srgbClr>
+          </w14:shadow>
         </w:rPr>
       </w:pPr>
       <w:bookmarkStart w:id="0" w:name="heading-1"/>
       <w:r>
         <w:rPr>
           <w:rFonts w:ascii="Arial" w:hAnsi="Arial" w:cs="Arial"/>
+          <w:b/>
+          <w:bCs/>
+          <w:smallCaps/>
+          <w:color w:val="EE0000"/>
+          <w14:shadow w14:blurRad="50800" w14:dist="38100" w14:dir="2700000" w14:sx="100000" w14:sy="100000" w14:kx="0" w14:ky="0" w14:algn="tl">
+            <w14:srgbClr w14:val="000000">
+              <w14:alpha w14:val="60000"/>
+            </w14:srgbClr>
+          </w14:shadow>
         </w:rPr>
         <w:t>Heading 1</w:t>
       </w:r>
@@ -109,12 +137,26 @@
         <w:pStyle w:val="Ttulo2"/>
         <w:rPr>
           <w:rFonts w:ascii="Arial" w:hAnsi="Arial" w:cs="Arial"/>
+          <w:smallCaps/>
+          <w:color w:val="A02B93" w:themeColor="accent5"/>
+          <w14:shadow w14:blurRad="50800" w14:dist="38100" w14:dir="2700000" w14:sx="100000" w14:sy="100000" w14:kx="0" w14:ky="0" w14:algn="tl">
+            <w14:srgbClr w14:val="000000">
+              <w14:alpha w14:val="60000"/>
+            </w14:srgbClr>
+          </w14:shadow>
         </w:rPr>
       </w:pPr>
       <w:bookmarkStart w:id="1" w:name="heading-2"/>
       <w:r>
         <w:rPr>
           <w:rFonts w:ascii="Arial" w:hAnsi="Arial" w:cs="Arial"/>
+          <w:smallCaps/>
+          <w:color w:val="A02B93" w:themeColor="accent5"/>
+          <w14:shadow w14:blurRad="50800" w14:dist="38100" w14:dir="2700000" w14:sx="100000" w14:sy="100000" w14:kx="0" w14:ky="0" w14:algn="tl">
+            <w14:srgbClr w14:val="000000">
+              <w14:alpha w14:val="60000"/>
+            </w14:srgbClr>
+          </w14:shadow>
         </w:rPr>
         <w:t>Heading 2</w:t>
       </w:r>
@@ -236,6 +278,7 @@
       <w:pPr>
         <w:pStyle w:val="FirstParagraph"/>
         <w:spacing w:before="0" w:after="200" w:line="276" w:lineRule="auto"/>
+        <w:jc w:val="both"/>
         <w:rPr>
           <w:rFonts w:ascii="Arial" w:hAnsi="Arial" w:cs="Arial"/>
           <w:sz w:val="22"/>
@@ -255,6 +298,7 @@
       <w:pPr>
         <w:pStyle w:val="Corpodetexto"/>
         <w:spacing w:before="0" w:after="200" w:line="276" w:lineRule="auto"/>
+        <w:jc w:val="both"/>
         <w:rPr>
           <w:rFonts w:ascii="Arial" w:hAnsi="Arial" w:cs="Arial"/>
           <w:sz w:val="22"/>
@@ -359,10 +403,12 @@
         <w:tc>
           <w:tcPr>
             <w:tcW w:w="0" w:type="auto"/>
+            <w:vAlign w:val="center"/>
           </w:tcPr>
           <w:p>
             <w:pPr>
               <w:pStyle w:val="Compact"/>
+              <w:jc w:val="center"/>
               <w:rPr>
                 <w:rFonts w:ascii="Arial" w:hAnsi="Arial" w:cs="Arial"/>
               </w:rPr>
@@ -378,6 +424,7 @@
         <w:tc>
           <w:tcPr>
             <w:tcW w:w="0" w:type="auto"/>
+            <w:vAlign w:val="center"/>
           </w:tcPr>
           <w:p>
             <w:pPr>
@@ -402,10 +449,12 @@
         <w:tc>
           <w:tcPr>
             <w:tcW w:w="0" w:type="auto"/>
+            <w:vAlign w:val="center"/>
           </w:tcPr>
           <w:p>
             <w:pPr>
               <w:pStyle w:val="Compact"/>
+              <w:jc w:val="center"/>
               <w:rPr>
                 <w:rFonts w:ascii="Arial" w:hAnsi="Arial" w:cs="Arial"/>
               </w:rPr>
@@ -421,6 +470,7 @@
         <w:tc>
           <w:tcPr>
             <w:tcW w:w="0" w:type="auto"/>
+            <w:vAlign w:val="center"/>
           </w:tcPr>
           <w:p>
             <w:pPr>
@@ -442,6 +492,7 @@
     <w:p>
       <w:pPr>
         <w:pStyle w:val="ImageCaption"/>
+        <w:spacing w:before="120" w:line="276" w:lineRule="auto"/>
         <w:rPr>
           <w:rFonts w:ascii="Arial" w:hAnsi="Arial" w:cs="Arial"/>
         </w:rPr>

</xml_diff>

<commit_message>
docs(root): reestrutura acervo historico e regenera documentos finais para 2026
</commit_message>
<xml_diff>
--- a/Documentos/template_estilos.docx
+++ b/Documentos/template_estilos.docx
@@ -110,6 +110,7 @@
     <w:p>
       <w:pPr>
         <w:pStyle w:val="Ttulo1"/>
+        <w:jc w:val="both"/>
         <w:rPr>
           <w:rFonts w:ascii="Arial" w:hAnsi="Arial" w:cs="Arial"/>
           <w:b/>
@@ -146,6 +147,7 @@
     <w:p>
       <w:pPr>
         <w:pStyle w:val="Ttulo2"/>
+        <w:jc w:val="both"/>
         <w:rPr>
           <w:rFonts w:ascii="Arial" w:hAnsi="Arial" w:cs="Arial"/>
           <w:smallCaps/>
@@ -178,6 +180,7 @@
     <w:p>
       <w:pPr>
         <w:pStyle w:val="Ttulo3"/>
+        <w:jc w:val="both"/>
         <w:rPr>
           <w:rFonts w:ascii="Arial" w:hAnsi="Arial" w:cs="Arial"/>
           <w:lang w:val="en-US"/>
@@ -196,6 +199,7 @@
     <w:p>
       <w:pPr>
         <w:pStyle w:val="Ttulo4"/>
+        <w:jc w:val="both"/>
         <w:rPr>
           <w:rFonts w:ascii="Arial" w:hAnsi="Arial" w:cs="Arial"/>
           <w:lang w:val="en-US"/>
@@ -214,6 +218,7 @@
     <w:p>
       <w:pPr>
         <w:pStyle w:val="Ttulo5"/>
+        <w:jc w:val="both"/>
         <w:rPr>
           <w:rFonts w:ascii="Arial" w:hAnsi="Arial" w:cs="Arial"/>
           <w:lang w:val="en-US"/>
@@ -232,6 +237,7 @@
     <w:p>
       <w:pPr>
         <w:pStyle w:val="Ttulo6"/>
+        <w:jc w:val="both"/>
         <w:rPr>
           <w:rFonts w:ascii="Arial" w:hAnsi="Arial" w:cs="Arial"/>
           <w:lang w:val="en-US"/>
@@ -250,6 +256,7 @@
     <w:p>
       <w:pPr>
         <w:pStyle w:val="Ttulo7"/>
+        <w:jc w:val="both"/>
         <w:rPr>
           <w:rFonts w:ascii="Arial" w:hAnsi="Arial" w:cs="Arial"/>
           <w:lang w:val="en-US"/>
@@ -268,6 +275,7 @@
     <w:p>
       <w:pPr>
         <w:pStyle w:val="Ttulo8"/>
+        <w:jc w:val="both"/>
         <w:rPr>
           <w:rFonts w:ascii="Arial" w:hAnsi="Arial" w:cs="Arial"/>
           <w:lang w:val="en-US"/>
@@ -286,6 +294,7 @@
     <w:p>
       <w:pPr>
         <w:pStyle w:val="Ttulo9"/>
+        <w:jc w:val="both"/>
         <w:rPr>
           <w:rFonts w:ascii="Arial" w:hAnsi="Arial" w:cs="Arial"/>
           <w:lang w:val="en-US"/>
@@ -396,6 +405,7 @@
     <w:p>
       <w:pPr>
         <w:pStyle w:val="Textoembloco"/>
+        <w:ind w:left="284"/>
         <w:jc w:val="both"/>
         <w:rPr>
           <w:rFonts w:ascii="Arial" w:hAnsi="Arial" w:cs="Arial"/>
@@ -416,35 +426,15 @@
         <w:jc w:val="both"/>
         <w:rPr>
           <w:rFonts w:ascii="Arial" w:hAnsi="Arial" w:cs="Arial"/>
-        </w:rPr>
-      </w:pPr>
-      <w:proofErr w:type="spellStart"/>
-      <w:r>
-        <w:rPr>
-          <w:rFonts w:ascii="Arial" w:hAnsi="Arial" w:cs="Arial"/>
-        </w:rPr>
-        <w:t>Table</w:t>
-      </w:r>
-      <w:proofErr w:type="spellEnd"/>
-      <w:r>
-        <w:rPr>
-          <w:rFonts w:ascii="Arial" w:hAnsi="Arial" w:cs="Arial"/>
-        </w:rPr>
-        <w:t xml:space="preserve"> </w:t>
-      </w:r>
-      <w:proofErr w:type="spellStart"/>
-      <w:r>
-        <w:rPr>
-          <w:rFonts w:ascii="Arial" w:hAnsi="Arial" w:cs="Arial"/>
-        </w:rPr>
-        <w:t>caption</w:t>
-      </w:r>
-      <w:proofErr w:type="spellEnd"/>
-      <w:r>
-        <w:rPr>
-          <w:rFonts w:ascii="Arial" w:hAnsi="Arial" w:cs="Arial"/>
-        </w:rPr>
-        <w:t>.</w:t>
+          <w:lang w:val="en-US"/>
+        </w:rPr>
+      </w:pPr>
+      <w:r>
+        <w:rPr>
+          <w:rFonts w:ascii="Arial" w:hAnsi="Arial" w:cs="Arial"/>
+          <w:lang w:val="en-US"/>
+        </w:rPr>
+        <w:t>Table caption.</w:t>
       </w:r>
     </w:p>
     <w:tbl>
@@ -708,6 +698,7 @@
       <w:tabs>
         <w:tab w:val="clear" w:pos="4252"/>
         <w:tab w:val="clear" w:pos="8504"/>
+        <w:tab w:val="center" w:pos="5387"/>
         <w:tab w:val="right" w:pos="10773"/>
       </w:tabs>
     </w:pPr>
@@ -748,6 +739,42 @@
         <w:t>1</w:t>
       </w:r>
     </w:fldSimple>
+    <w:r>
+      <w:rPr>
+        <w:noProof/>
+      </w:rPr>
+      <w:tab/>
+    </w:r>
+    <w:r>
+      <w:rPr>
+        <w:noProof/>
+      </w:rPr>
+      <w:fldChar w:fldCharType="begin"/>
+    </w:r>
+    <w:r>
+      <w:rPr>
+        <w:noProof/>
+      </w:rPr>
+      <w:instrText xml:space="preserve"> PRINTDATE  \@ "dd/MM/yy HH:mm"  \* MERGEFORMAT </w:instrText>
+    </w:r>
+    <w:r>
+      <w:rPr>
+        <w:noProof/>
+      </w:rPr>
+      <w:fldChar w:fldCharType="separate"/>
+    </w:r>
+    <w:r>
+      <w:rPr>
+        <w:noProof/>
+      </w:rPr>
+      <w:t>00/00/00 00:00</w:t>
+    </w:r>
+    <w:r>
+      <w:rPr>
+        <w:noProof/>
+      </w:rPr>
+      <w:fldChar w:fldCharType="end"/>
+    </w:r>
   </w:p>
 </w:ftr>
 </file>

</xml_diff>